<commit_message>
Move demo slide after post-processing; update script and video guide
Co-Authored-By: Claude Opus 5.5 <noreply@anthropic.com>
Claude-Session: https://claude.ai/code/session_01AnZDiX8uz3hSw1L6vhKaQS
</commit_message>
<xml_diff>
--- a/deliverables/final-defense/docs/Guide_Video_Demo.docx
+++ b/deliverables/final-defense/docs/Guide_Video_Demo.docx
@@ -46,10 +46,10 @@
           <w:bCs/>
           <w:b/>
         </w:rPr>
-        <w:t xml:space="preserve">diapo 11 « Démonstration »</w:t>
-      </w:r>
-      <w:r>
-        <w:t xml:space="preserve">, déjà prévue dans le support : juste après l’explication du recto/verso (diapo 10) et avant le parcours après capture (diapo 12).</w:t>
+        <w:t xml:space="preserve">diapo 12 « Démonstration »</w:t>
+      </w:r>
+      <w:r>
+        <w:t xml:space="preserve">, déjà prévue dans le support : après le recto/verso (diapo 10) et le post-traitement (diapo 11). La vidéo montre alors tout le parcours en une fois, comme une synthèse, avant les tests et les résultats.</w:t>
       </w:r>
     </w:p>
     <w:p>
@@ -1117,7 +1117,7 @@
         <w:pStyle w:val="BodyText"/>
       </w:pPr>
       <w:r>
-        <w:t xml:space="preserve">La vidéo remplace automatiquement le cadre de la diapo 11.</w:t>
+        <w:t xml:space="preserve">La vidéo remplace automatiquement le cadre de la diapo 12.</w:t>
       </w:r>
     </w:p>
     <w:p>
@@ -1135,7 +1135,7 @@
         <w:t xml:space="preserve"> </w:t>
       </w:r>
       <w:r>
-        <w:t xml:space="preserve">1. Diapo 11 → supprimer l’image du cadre.</w:t>
+        <w:t xml:space="preserve">1. Diapo 12 → supprimer l’image du cadre.</w:t>
       </w:r>
       <w:r>
         <w:t xml:space="preserve"> </w:t>
@@ -1264,7 +1264,7 @@
         <w:t xml:space="preserve"> </w:t>
       </w:r>
       <w:r>
-        <w:t xml:space="preserve">- Si la vidéo ne se lance pas, montrer les captures de la diapo 12 et dire : « Je vous montre le parcours sur ces captures. »</w:t>
+        <w:t xml:space="preserve">- Si la vidéo ne se lance pas, revenir aux captures de la diapo 11 et dire : « Je vous montre le parcours sur ces captures. »</w:t>
       </w:r>
     </w:p>
     <w:bookmarkEnd w:id="26"/>

</xml_diff>